<commit_message>
flytechnology.ua contract: executor FOP Zolotaryova, date 20.10.2026
Co-Authored-By: Claude Opus 5.5 <noreply@anthropic.com>
Claude-Session: https://claude.ai/code/session_01R7HKRNsx3JxTQyc1y8TuYC
</commit_message>
<xml_diff>
--- a/contracts/output/Договір_SEO_flytechnology.ua_10-2026_фінал.docx
+++ b/contracts/output/Договір_SEO_flytechnology.ua_10-2026_фінал.docx
@@ -137,7 +137,6 @@
           <w:color w:val="000000"/>
           <w:sz w:val="24"/>
           <w:szCs w:val="24"/>
-          <w:highlight w:val="yellow"/>
           <w:rtl w:val="0"/>
         </w:rPr>
         <w:t xml:space="preserve">«</w:t>
@@ -146,17 +145,15 @@
         <w:rPr>
           <w:sz w:val="24"/>
           <w:szCs w:val="24"/>
-          <w:highlight w:val="yellow"/>
-          <w:rtl w:val="0"/>
-        </w:rPr>
-        <w:t xml:space="preserve">12</w:t>
-      </w:r>
-      <w:r>
-        <w:rPr>
-          <w:color w:val="000000"/>
-          <w:sz w:val="24"/>
-          <w:szCs w:val="24"/>
-          <w:highlight w:val="yellow"/>
+          <w:rtl w:val="0"/>
+        </w:rPr>
+        <w:t>20</w:t>
+      </w:r>
+      <w:r>
+        <w:rPr>
+          <w:color w:val="000000"/>
+          <w:sz w:val="24"/>
+          <w:szCs w:val="24"/>
           <w:rtl w:val="0"/>
         </w:rPr>
         <w:t xml:space="preserve">» </w:t>
@@ -165,7 +162,6 @@
         <w:rPr>
           <w:sz w:val="24"/>
           <w:szCs w:val="24"/>
-          <w:highlight w:val="yellow"/>
           <w:rtl w:val="0"/>
         </w:rPr>
         <w:t xml:space="preserve">жовтня </w:t>
@@ -175,26 +171,23 @@
           <w:color w:val="000000"/>
           <w:sz w:val="24"/>
           <w:szCs w:val="24"/>
-          <w:highlight w:val="yellow"/>
-          <w:rtl w:val="0"/>
-        </w:rPr>
-        <w:t xml:space="preserve">20</w:t>
-      </w:r>
-      <w:r>
-        <w:rPr>
-          <w:sz w:val="24"/>
-          <w:szCs w:val="24"/>
-          <w:highlight w:val="yellow"/>
-          <w:rtl w:val="0"/>
-        </w:rPr>
-        <w:t xml:space="preserve">26</w:t>
-      </w:r>
-      <w:r>
-        <w:rPr>
-          <w:color w:val="000000"/>
-          <w:sz w:val="24"/>
-          <w:szCs w:val="24"/>
-          <w:highlight w:val="yellow"/>
+          <w:rtl w:val="0"/>
+        </w:rPr>
+        <w:t>20</w:t>
+      </w:r>
+      <w:r>
+        <w:rPr>
+          <w:sz w:val="24"/>
+          <w:szCs w:val="24"/>
+          <w:rtl w:val="0"/>
+        </w:rPr>
+        <w:t>26</w:t>
+      </w:r>
+      <w:r>
+        <w:rPr>
+          <w:color w:val="000000"/>
+          <w:sz w:val="24"/>
+          <w:szCs w:val="24"/>
           <w:rtl w:val="0"/>
         </w:rPr>
         <w:t xml:space="preserve"> р.</w:t>
@@ -270,15 +263,15 @@
           <w:szCs w:val="24"/>
           <w:rtl w:val="0"/>
         </w:rPr>
-        <w:t xml:space="preserve">Фізична особа-підприємець Турчихін Євгеній Леонідович</w:t>
-      </w:r>
-      <w:r>
-        <w:rPr>
-          <w:sz w:val="24"/>
-          <w:szCs w:val="24"/>
-          <w:rtl w:val="0"/>
-        </w:rPr>
-        <w:t xml:space="preserve">, який діє на підставі свідоцтва з Єдиного державного реєстру юридичних осіб та фізичних осіб-підприємців згідно витягу: номер запису в Єдиному державному реєстрі 10000001624250, дата 19.09.2019, та є платником єдиного податку на підставі витягу з реєстру платників єдиного податку №1904663401145 від 01.10.2019, з іншої сторони, іменований надалі «Виконавець», разом «Сторони», а кожна окремо «Сторона»,  уклали даний Договір (далі – Договір)</w:t>
+        <w:t>Фізична особа-підприємець Золотарьова Катерина Володимирівна</w:t>
+      </w:r>
+      <w:r>
+        <w:rPr>
+          <w:sz w:val="24"/>
+          <w:szCs w:val="24"/>
+          <w:rtl w:val="0"/>
+        </w:rPr>
+        <w:t>, що діє на підставі свідоцтва про державну реєстрацію № 492659 від 28.05.2013, та є платником єдиного податку на підставі свідоцтва про сплату єдиного податку серії АВ № 342537 від 03.07.2013, з іншої сторони, іменований надалі «Виконавець», разом «Сторони», а кожна окремо «Сторона», уклали даний Договір (далі – Договір)</w:t>
       </w:r>
       <w:r>
         <w:rPr>
@@ -4459,7 +4452,7 @@
                 <w:szCs w:val="24"/>
                 <w:rtl w:val="0"/>
               </w:rPr>
-              <w:t xml:space="preserve">ФОП Турчіхін Євгеній Леонідович</w:t>
+              <w:t>ФОП Золотарьова Катерина Володимирівна</w:t>
             </w:r>
           </w:p>
           <w:p>
@@ -4476,9 +4469,7 @@
                 <w:szCs w:val="24"/>
                 <w:rtl w:val="0"/>
               </w:rPr>
-              <w:t xml:space="preserve">РНОКПП:3000215152</w:t>
-              <w:br w:type="textWrapping"/>
-              <w:t xml:space="preserve">Свідоцтво єдиного податку </w:t>
+              <w:t>Свідоцтво № 492659</w:t>
             </w:r>
           </w:p>
           <w:p>
@@ -4495,7 +4486,7 @@
                 <w:szCs w:val="24"/>
                 <w:rtl w:val="0"/>
               </w:rPr>
-              <w:t xml:space="preserve">№ 1904663401145 від 01.10.2019</w:t>
+              <w:t>Від: «28» травня 2013 р.</w:t>
             </w:r>
           </w:p>
           <w:p>
@@ -4512,7 +4503,7 @@
                 <w:szCs w:val="24"/>
                 <w:rtl w:val="0"/>
               </w:rPr>
-              <w:t xml:space="preserve">Поточний рахунок:</w:t>
+              <w:t>Свідоцтво про сплату єдиного податку серія АВ № 342537</w:t>
             </w:r>
           </w:p>
           <w:p>
@@ -4529,7 +4520,7 @@
                 <w:szCs w:val="24"/>
                 <w:rtl w:val="0"/>
               </w:rPr>
-              <w:t xml:space="preserve">UA933052990000026009036220643 </w:t>
+              <w:t>Від 3 липня 2013 р.</w:t>
             </w:r>
           </w:p>
           <w:p>
@@ -4546,7 +4537,7 @@
                 <w:szCs w:val="24"/>
                 <w:rtl w:val="0"/>
               </w:rPr>
-              <w:t xml:space="preserve">в АТ КБ "ПРИВАТБАНК"</w:t>
+              <w:t>ІПН: 3178815880</w:t>
             </w:r>
           </w:p>
           <w:p>
@@ -4563,7 +4554,7 @@
                 <w:szCs w:val="24"/>
                 <w:rtl w:val="0"/>
               </w:rPr>
-              <w:t xml:space="preserve">ЄДРПОУ банку 14360570, </w:t>
+              <w:t>Р/р UA073510050000026005450205200 в АКІБ «Укрсіббанк»</w:t>
             </w:r>
           </w:p>
           <w:p>
@@ -4580,7 +4571,7 @@
                 <w:szCs w:val="24"/>
                 <w:rtl w:val="0"/>
               </w:rPr>
-              <w:t xml:space="preserve">код банку 300711</w:t>
+              <w:t>МФО: 351005</w:t>
             </w:r>
           </w:p>
           <w:p>
@@ -4593,8 +4584,11 @@
             </w:pPr>
             <w:r>
               <w:rPr>
-                <w:rtl w:val="0"/>
-              </w:rPr>
+                <w:sz w:val="24"/>
+                <w:szCs w:val="24"/>
+                <w:rtl w:val="0"/>
+              </w:rPr>
+              <w:t>Вчасно: katerina.zolotaryova@gmail.com</w:t>
             </w:r>
           </w:p>
           <w:p>
@@ -4637,7 +4631,7 @@
                 <w:szCs w:val="24"/>
                 <w:rtl w:val="0"/>
               </w:rPr>
-              <w:t xml:space="preserve">Турчіхін Є.Л.</w:t>
+              <w:t>Золотарьова К.В.</w:t>
             </w:r>
           </w:p>
           <w:p>
@@ -5379,19 +5373,17 @@
           <w:bCs w:val="1"/>
           <w:sz w:val="24"/>
           <w:szCs w:val="24"/>
-          <w:highlight w:val="yellow"/>
-          <w:rtl w:val="0"/>
-        </w:rPr>
-        <w:t xml:space="preserve">12</w:t>
-      </w:r>
-      <w:r>
-        <w:rPr>
-          <w:b w:val="1"/>
-          <w:bCs w:val="1"/>
-          <w:color w:val="000000"/>
-          <w:sz w:val="24"/>
-          <w:szCs w:val="24"/>
-          <w:highlight w:val="yellow"/>
+          <w:rtl w:val="0"/>
+        </w:rPr>
+        <w:t>20</w:t>
+      </w:r>
+      <w:r>
+        <w:rPr>
+          <w:b w:val="1"/>
+          <w:bCs w:val="1"/>
+          <w:color w:val="000000"/>
+          <w:sz w:val="24"/>
+          <w:szCs w:val="24"/>
           <w:rtl w:val="0"/>
         </w:rPr>
         <w:t xml:space="preserve"> </w:t>
@@ -5402,7 +5394,6 @@
           <w:bCs w:val="1"/>
           <w:sz w:val="24"/>
           <w:szCs w:val="24"/>
-          <w:highlight w:val="yellow"/>
           <w:rtl w:val="0"/>
         </w:rPr>
         <w:t xml:space="preserve">жовтня </w:t>
@@ -5414,21 +5405,19 @@
           <w:color w:val="000000"/>
           <w:sz w:val="24"/>
           <w:szCs w:val="24"/>
-          <w:highlight w:val="yellow"/>
-          <w:rtl w:val="0"/>
-        </w:rPr>
-        <w:t xml:space="preserve">20</w:t>
-      </w:r>
-      <w:r>
-        <w:rPr>
-          <w:b w:val="1"/>
-          <w:bCs w:val="1"/>
-          <w:sz w:val="24"/>
-          <w:szCs w:val="24"/>
-          <w:highlight w:val="yellow"/>
-          <w:rtl w:val="0"/>
-        </w:rPr>
-        <w:t xml:space="preserve">26</w:t>
+          <w:rtl w:val="0"/>
+        </w:rPr>
+        <w:t>20</w:t>
+      </w:r>
+      <w:r>
+        <w:rPr>
+          <w:b w:val="1"/>
+          <w:bCs w:val="1"/>
+          <w:sz w:val="24"/>
+          <w:szCs w:val="24"/>
+          <w:rtl w:val="0"/>
+        </w:rPr>
+        <w:t>26</w:t>
       </w:r>
       <w:r>
         <w:rPr>
@@ -6649,7 +6638,7 @@
                 <w:szCs w:val="24"/>
                 <w:rtl w:val="0"/>
               </w:rPr>
-              <w:t xml:space="preserve">ФОП Турчіхін Євгеній Леонідович</w:t>
+              <w:t>ФОП Золотарьова Катерина Володимирівна</w:t>
             </w:r>
           </w:p>
           <w:p>
@@ -6666,9 +6655,7 @@
                 <w:szCs w:val="24"/>
                 <w:rtl w:val="0"/>
               </w:rPr>
-              <w:t xml:space="preserve">РНОКПП:3000215152</w:t>
-              <w:br w:type="textWrapping"/>
-              <w:t xml:space="preserve">Свідоцтво єдиного податку </w:t>
+              <w:t>Свідоцтво № 492659</w:t>
             </w:r>
           </w:p>
           <w:p>
@@ -6685,7 +6672,7 @@
                 <w:szCs w:val="24"/>
                 <w:rtl w:val="0"/>
               </w:rPr>
-              <w:t xml:space="preserve">№ 1904663401145 від 01.10.2019</w:t>
+              <w:t>Від: «28» травня 2013 р.</w:t>
             </w:r>
           </w:p>
           <w:p>
@@ -6702,7 +6689,7 @@
                 <w:szCs w:val="24"/>
                 <w:rtl w:val="0"/>
               </w:rPr>
-              <w:t xml:space="preserve">Поточний рахунок:</w:t>
+              <w:t>Свідоцтво про сплату єдиного податку серія АВ № 342537</w:t>
             </w:r>
           </w:p>
           <w:p>
@@ -6719,7 +6706,7 @@
                 <w:szCs w:val="24"/>
                 <w:rtl w:val="0"/>
               </w:rPr>
-              <w:t xml:space="preserve">UA933052990000026009036220643 </w:t>
+              <w:t>Від 3 липня 2013 р.</w:t>
             </w:r>
           </w:p>
           <w:p>
@@ -6736,7 +6723,7 @@
                 <w:szCs w:val="24"/>
                 <w:rtl w:val="0"/>
               </w:rPr>
-              <w:t xml:space="preserve">в АТ КБ "ПРИВАТБАНК"</w:t>
+              <w:t>ІПН: 3178815880</w:t>
             </w:r>
           </w:p>
           <w:p>
@@ -6753,7 +6740,7 @@
                 <w:szCs w:val="24"/>
                 <w:rtl w:val="0"/>
               </w:rPr>
-              <w:t xml:space="preserve">ЄДРПОУ банку 14360570, </w:t>
+              <w:t>Р/р UA073510050000026005450205200 в АКІБ «Укрсіббанк»</w:t>
             </w:r>
           </w:p>
           <w:p>
@@ -6770,7 +6757,7 @@
                 <w:szCs w:val="24"/>
                 <w:rtl w:val="0"/>
               </w:rPr>
-              <w:t xml:space="preserve">код банку 300711</w:t>
+              <w:t>МФО: 351005</w:t>
             </w:r>
           </w:p>
           <w:p>
@@ -6783,8 +6770,11 @@
             </w:pPr>
             <w:r>
               <w:rPr>
-                <w:rtl w:val="0"/>
-              </w:rPr>
+                <w:sz w:val="24"/>
+                <w:szCs w:val="24"/>
+                <w:rtl w:val="0"/>
+              </w:rPr>
+              <w:t>Вчасно: katerina.zolotaryova@gmail.com</w:t>
             </w:r>
           </w:p>
           <w:p>
@@ -6827,7 +6817,7 @@
                 <w:szCs w:val="24"/>
                 <w:rtl w:val="0"/>
               </w:rPr>
-              <w:t xml:space="preserve">Турчіхін Є.Л.</w:t>
+              <w:t>Золотарьова К.В.</w:t>
             </w:r>
           </w:p>
           <w:p>

</xml_diff>